<commit_message>
Update Appointment with associations, booking validation and cancellation
</commit_message>
<xml_diff>
--- a/week 7/Stage_4_SmartCare_v04_Domain_Implementation_Workbook (1).docx
+++ b/week 7/Stage_4_SmartCare_v04_Domain_Implementation_Workbook (1).docx
@@ -40,15 +40,15 @@
         <w:tblLook w:val="04A0" w:firstRow="1" w:lastRow="0" w:firstColumn="1" w:lastColumn="0" w:noHBand="0" w:noVBand="1"/>
       </w:tblPr>
       <w:tblGrid>
-        <w:gridCol w:w="2518"/>
-        <w:gridCol w:w="2517"/>
-        <w:gridCol w:w="2518"/>
-        <w:gridCol w:w="2517"/>
+        <w:gridCol w:w="2419"/>
+        <w:gridCol w:w="3476"/>
+        <w:gridCol w:w="2086"/>
+        <w:gridCol w:w="2089"/>
       </w:tblGrid>
       <w:tr>
         <w:tc>
           <w:tcPr>
-            <w:tcW w:w="2520" w:type="dxa"/>
+            <w:tcW w:w="2419" w:type="dxa"/>
           </w:tcPr>
           <w:p>
             <w:r>
@@ -58,7 +58,7 @@
         </w:tc>
         <w:tc>
           <w:tcPr>
-            <w:tcW w:w="2520" w:type="dxa"/>
+            <w:tcW w:w="3476" w:type="dxa"/>
           </w:tcPr>
           <w:p>
             <w:r>
@@ -68,7 +68,7 @@
         </w:tc>
         <w:tc>
           <w:tcPr>
-            <w:tcW w:w="2520" w:type="dxa"/>
+            <w:tcW w:w="2086" w:type="dxa"/>
           </w:tcPr>
           <w:p>
             <w:r>
@@ -78,7 +78,7 @@
         </w:tc>
         <w:tc>
           <w:tcPr>
-            <w:tcW w:w="2520" w:type="dxa"/>
+            <w:tcW w:w="2089" w:type="dxa"/>
           </w:tcPr>
           <w:p>
             <w:r>
@@ -90,261 +90,1027 @@
       <w:tr>
         <w:tc>
           <w:tcPr>
-            <w:tcW w:w="2520" w:type="dxa"/>
-          </w:tcPr>
-          <w:p/>
-        </w:tc>
-        <w:tc>
-          <w:tcPr>
-            <w:tcW w:w="2520" w:type="dxa"/>
-          </w:tcPr>
-          <w:p/>
-        </w:tc>
-        <w:tc>
-          <w:tcPr>
-            <w:tcW w:w="2520" w:type="dxa"/>
-          </w:tcPr>
-          <w:p/>
-        </w:tc>
-        <w:tc>
-          <w:tcPr>
-            <w:tcW w:w="2520" w:type="dxa"/>
-          </w:tcPr>
-          <w:p/>
+            <w:tcW w:w="2419" w:type="dxa"/>
+          </w:tcPr>
+          <w:p>
+            <w:r>
+              <w:t>Patient class</w:t>
+            </w:r>
+          </w:p>
+        </w:tc>
+        <w:tc>
+          <w:tcPr>
+            <w:tcW w:w="3476" w:type="dxa"/>
+          </w:tcPr>
+          <w:p>
+            <w:r>
+              <w:t>class patient</w:t>
+            </w:r>
+          </w:p>
+        </w:tc>
+        <w:tc>
+          <w:tcPr>
+            <w:tcW w:w="2086" w:type="dxa"/>
+          </w:tcPr>
+          <w:p>
+            <w:r>
+              <w:t xml:space="preserve">Yes </w:t>
+            </w:r>
+          </w:p>
+        </w:tc>
+        <w:tc>
+          <w:tcPr>
+            <w:tcW w:w="2089" w:type="dxa"/>
+          </w:tcPr>
+          <w:p>
+            <w:r>
+              <w:t>Implemented as a Python class representing a SmartCare patient.</w:t>
+            </w:r>
+          </w:p>
         </w:tc>
       </w:tr>
       <w:tr>
         <w:tc>
           <w:tcPr>
-            <w:tcW w:w="2520" w:type="dxa"/>
-          </w:tcPr>
-          <w:p/>
-        </w:tc>
-        <w:tc>
-          <w:tcPr>
-            <w:tcW w:w="2520" w:type="dxa"/>
-          </w:tcPr>
-          <w:p/>
-        </w:tc>
-        <w:tc>
-          <w:tcPr>
-            <w:tcW w:w="2520" w:type="dxa"/>
-          </w:tcPr>
-          <w:p/>
-        </w:tc>
-        <w:tc>
-          <w:tcPr>
-            <w:tcW w:w="2520" w:type="dxa"/>
-          </w:tcPr>
-          <w:p/>
+            <w:tcW w:w="2419" w:type="dxa"/>
+          </w:tcPr>
+          <w:p>
+            <w:proofErr w:type="spellStart"/>
+            <w:r>
+              <w:t>patientID</w:t>
+            </w:r>
+            <w:proofErr w:type="spellEnd"/>
+          </w:p>
+        </w:tc>
+        <w:tc>
+          <w:tcPr>
+            <w:tcW w:w="3476" w:type="dxa"/>
+          </w:tcPr>
+          <w:p>
+            <w:proofErr w:type="spellStart"/>
+            <w:proofErr w:type="gramStart"/>
+            <w:r>
+              <w:t>self.patientID</w:t>
+            </w:r>
+            <w:proofErr w:type="spellEnd"/>
+            <w:proofErr w:type="gramEnd"/>
+          </w:p>
+        </w:tc>
+        <w:tc>
+          <w:tcPr>
+            <w:tcW w:w="2086" w:type="dxa"/>
+          </w:tcPr>
+          <w:p>
+            <w:r>
+              <w:t>Yes</w:t>
+            </w:r>
+          </w:p>
+        </w:tc>
+        <w:tc>
+          <w:tcPr>
+            <w:tcW w:w="2089" w:type="dxa"/>
+          </w:tcPr>
+          <w:p>
+            <w:r>
+              <w:t>Stores the patients unique ID.</w:t>
+            </w:r>
+          </w:p>
         </w:tc>
       </w:tr>
       <w:tr>
         <w:tc>
           <w:tcPr>
-            <w:tcW w:w="2520" w:type="dxa"/>
-          </w:tcPr>
-          <w:p/>
-        </w:tc>
-        <w:tc>
-          <w:tcPr>
-            <w:tcW w:w="2520" w:type="dxa"/>
-          </w:tcPr>
-          <w:p/>
-        </w:tc>
-        <w:tc>
-          <w:tcPr>
-            <w:tcW w:w="2520" w:type="dxa"/>
-          </w:tcPr>
-          <w:p/>
-        </w:tc>
-        <w:tc>
-          <w:tcPr>
-            <w:tcW w:w="2520" w:type="dxa"/>
-          </w:tcPr>
-          <w:p/>
+            <w:tcW w:w="2419" w:type="dxa"/>
+          </w:tcPr>
+          <w:p>
+            <w:r>
+              <w:t>name</w:t>
+            </w:r>
+          </w:p>
+        </w:tc>
+        <w:tc>
+          <w:tcPr>
+            <w:tcW w:w="3476" w:type="dxa"/>
+          </w:tcPr>
+          <w:p>
+            <w:r>
+              <w:t>self.name</w:t>
+            </w:r>
+          </w:p>
+        </w:tc>
+        <w:tc>
+          <w:tcPr>
+            <w:tcW w:w="2086" w:type="dxa"/>
+          </w:tcPr>
+          <w:p>
+            <w:r>
+              <w:t>Yes</w:t>
+            </w:r>
+          </w:p>
+        </w:tc>
+        <w:tc>
+          <w:tcPr>
+            <w:tcW w:w="2089" w:type="dxa"/>
+          </w:tcPr>
+          <w:p>
+            <w:r>
+              <w:t xml:space="preserve">Stores the </w:t>
+            </w:r>
+            <w:proofErr w:type="gramStart"/>
+            <w:r>
+              <w:t>patients</w:t>
+            </w:r>
+            <w:proofErr w:type="gramEnd"/>
+            <w:r>
+              <w:t xml:space="preserve"> name.</w:t>
+            </w:r>
+          </w:p>
         </w:tc>
       </w:tr>
       <w:tr>
         <w:tc>
           <w:tcPr>
-            <w:tcW w:w="2520" w:type="dxa"/>
-          </w:tcPr>
-          <w:p/>
-        </w:tc>
-        <w:tc>
-          <w:tcPr>
-            <w:tcW w:w="2520" w:type="dxa"/>
-          </w:tcPr>
-          <w:p/>
-        </w:tc>
-        <w:tc>
-          <w:tcPr>
-            <w:tcW w:w="2520" w:type="dxa"/>
-          </w:tcPr>
-          <w:p/>
-        </w:tc>
-        <w:tc>
-          <w:tcPr>
-            <w:tcW w:w="2520" w:type="dxa"/>
-          </w:tcPr>
-          <w:p/>
+            <w:tcW w:w="2419" w:type="dxa"/>
+          </w:tcPr>
+          <w:p>
+            <w:proofErr w:type="spellStart"/>
+            <w:r>
+              <w:t>contactDetails</w:t>
+            </w:r>
+            <w:proofErr w:type="spellEnd"/>
+          </w:p>
+        </w:tc>
+        <w:tc>
+          <w:tcPr>
+            <w:tcW w:w="3476" w:type="dxa"/>
+          </w:tcPr>
+          <w:p>
+            <w:proofErr w:type="spellStart"/>
+            <w:r>
+              <w:t>Slef.contactDetails</w:t>
+            </w:r>
+            <w:proofErr w:type="spellEnd"/>
+          </w:p>
+        </w:tc>
+        <w:tc>
+          <w:tcPr>
+            <w:tcW w:w="2086" w:type="dxa"/>
+          </w:tcPr>
+          <w:p>
+            <w:r>
+              <w:t>Yes</w:t>
+            </w:r>
+          </w:p>
+        </w:tc>
+        <w:tc>
+          <w:tcPr>
+            <w:tcW w:w="2089" w:type="dxa"/>
+          </w:tcPr>
+          <w:p>
+            <w:r>
+              <w:t>Stores patient contact details.</w:t>
+            </w:r>
+          </w:p>
         </w:tc>
       </w:tr>
       <w:tr>
         <w:tc>
           <w:tcPr>
-            <w:tcW w:w="2520" w:type="dxa"/>
-          </w:tcPr>
-          <w:p/>
-        </w:tc>
-        <w:tc>
-          <w:tcPr>
-            <w:tcW w:w="2520" w:type="dxa"/>
-          </w:tcPr>
-          <w:p/>
-        </w:tc>
-        <w:tc>
-          <w:tcPr>
-            <w:tcW w:w="2520" w:type="dxa"/>
-          </w:tcPr>
-          <w:p/>
-        </w:tc>
-        <w:tc>
-          <w:tcPr>
-            <w:tcW w:w="2520" w:type="dxa"/>
-          </w:tcPr>
-          <w:p/>
+            <w:tcW w:w="2419" w:type="dxa"/>
+          </w:tcPr>
+          <w:p>
+            <w:proofErr w:type="spellStart"/>
+            <w:proofErr w:type="gramStart"/>
+            <w:r>
+              <w:t>requestAppointment</w:t>
+            </w:r>
+            <w:proofErr w:type="spellEnd"/>
+            <w:r>
+              <w:t>(</w:t>
+            </w:r>
+            <w:proofErr w:type="gramEnd"/>
+            <w:r>
+              <w:t>)</w:t>
+            </w:r>
+          </w:p>
+        </w:tc>
+        <w:tc>
+          <w:tcPr>
+            <w:tcW w:w="3476" w:type="dxa"/>
+          </w:tcPr>
+          <w:p>
+            <w:proofErr w:type="spellStart"/>
+            <w:r>
+              <w:t>Patient.requestAppointment</w:t>
+            </w:r>
+            <w:proofErr w:type="spellEnd"/>
+            <w:r>
+              <w:t>()</w:t>
+            </w:r>
+          </w:p>
+        </w:tc>
+        <w:tc>
+          <w:tcPr>
+            <w:tcW w:w="2086" w:type="dxa"/>
+          </w:tcPr>
+          <w:p>
+            <w:r>
+              <w:t>Yes</w:t>
+            </w:r>
+          </w:p>
+        </w:tc>
+        <w:tc>
+          <w:tcPr>
+            <w:tcW w:w="2089" w:type="dxa"/>
+          </w:tcPr>
+          <w:p>
+            <w:r>
+              <w:t>Displays a message showing that the patient requested an appointment.</w:t>
+            </w:r>
+          </w:p>
         </w:tc>
       </w:tr>
       <w:tr>
         <w:tc>
           <w:tcPr>
-            <w:tcW w:w="2520" w:type="dxa"/>
-          </w:tcPr>
-          <w:p/>
-        </w:tc>
-        <w:tc>
-          <w:tcPr>
-            <w:tcW w:w="2520" w:type="dxa"/>
-          </w:tcPr>
-          <w:p/>
-        </w:tc>
-        <w:tc>
-          <w:tcPr>
-            <w:tcW w:w="2520" w:type="dxa"/>
-          </w:tcPr>
-          <w:p/>
-        </w:tc>
-        <w:tc>
-          <w:tcPr>
-            <w:tcW w:w="2520" w:type="dxa"/>
-          </w:tcPr>
-          <w:p/>
+            <w:tcW w:w="2419" w:type="dxa"/>
+          </w:tcPr>
+          <w:p>
+            <w:proofErr w:type="spellStart"/>
+            <w:proofErr w:type="gramStart"/>
+            <w:r>
+              <w:t>cancelAppointment</w:t>
+            </w:r>
+            <w:proofErr w:type="spellEnd"/>
+            <w:r>
+              <w:t>(</w:t>
+            </w:r>
+            <w:proofErr w:type="gramEnd"/>
+            <w:r>
+              <w:t>)</w:t>
+            </w:r>
+          </w:p>
+        </w:tc>
+        <w:tc>
+          <w:tcPr>
+            <w:tcW w:w="3476" w:type="dxa"/>
+          </w:tcPr>
+          <w:p>
+            <w:proofErr w:type="spellStart"/>
+            <w:r>
+              <w:t>Patient.cancelAppointment</w:t>
+            </w:r>
+            <w:proofErr w:type="spellEnd"/>
+            <w:r>
+              <w:t>()</w:t>
+            </w:r>
+          </w:p>
+        </w:tc>
+        <w:tc>
+          <w:tcPr>
+            <w:tcW w:w="2086" w:type="dxa"/>
+          </w:tcPr>
+          <w:p>
+            <w:r>
+              <w:t>Yes</w:t>
+            </w:r>
+          </w:p>
+        </w:tc>
+        <w:tc>
+          <w:tcPr>
+            <w:tcW w:w="2089" w:type="dxa"/>
+          </w:tcPr>
+          <w:p>
+            <w:r>
+              <w:t>Calls the appointment’s cancel operation.</w:t>
+            </w:r>
+          </w:p>
         </w:tc>
       </w:tr>
       <w:tr>
         <w:tc>
           <w:tcPr>
-            <w:tcW w:w="2520" w:type="dxa"/>
-          </w:tcPr>
-          <w:p/>
-        </w:tc>
-        <w:tc>
-          <w:tcPr>
-            <w:tcW w:w="2520" w:type="dxa"/>
-          </w:tcPr>
-          <w:p/>
-        </w:tc>
-        <w:tc>
-          <w:tcPr>
-            <w:tcW w:w="2520" w:type="dxa"/>
-          </w:tcPr>
-          <w:p/>
-        </w:tc>
-        <w:tc>
-          <w:tcPr>
-            <w:tcW w:w="2520" w:type="dxa"/>
-          </w:tcPr>
-          <w:p/>
+            <w:tcW w:w="2419" w:type="dxa"/>
+          </w:tcPr>
+          <w:p>
+            <w:r>
+              <w:t>Practitioner class</w:t>
+            </w:r>
+          </w:p>
+        </w:tc>
+        <w:tc>
+          <w:tcPr>
+            <w:tcW w:w="3476" w:type="dxa"/>
+          </w:tcPr>
+          <w:p>
+            <w:r>
+              <w:t xml:space="preserve">Class practitioner </w:t>
+            </w:r>
+          </w:p>
+        </w:tc>
+        <w:tc>
+          <w:tcPr>
+            <w:tcW w:w="2086" w:type="dxa"/>
+          </w:tcPr>
+          <w:p>
+            <w:r>
+              <w:t>Yes</w:t>
+            </w:r>
+          </w:p>
+        </w:tc>
+        <w:tc>
+          <w:tcPr>
+            <w:tcW w:w="2089" w:type="dxa"/>
+          </w:tcPr>
+          <w:p>
+            <w:r>
+              <w:t>Implemented as a Python class representing a practitioner.</w:t>
+            </w:r>
+          </w:p>
         </w:tc>
       </w:tr>
       <w:tr>
         <w:tc>
           <w:tcPr>
-            <w:tcW w:w="2520" w:type="dxa"/>
-          </w:tcPr>
-          <w:p/>
-        </w:tc>
-        <w:tc>
-          <w:tcPr>
-            <w:tcW w:w="2520" w:type="dxa"/>
-          </w:tcPr>
-          <w:p/>
-        </w:tc>
-        <w:tc>
-          <w:tcPr>
-            <w:tcW w:w="2520" w:type="dxa"/>
-          </w:tcPr>
-          <w:p/>
-        </w:tc>
-        <w:tc>
-          <w:tcPr>
-            <w:tcW w:w="2520" w:type="dxa"/>
-          </w:tcPr>
+            <w:tcW w:w="2419" w:type="dxa"/>
+          </w:tcPr>
+          <w:p>
+            <w:proofErr w:type="spellStart"/>
+            <w:r>
+              <w:t>practitionerID</w:t>
+            </w:r>
+            <w:proofErr w:type="spellEnd"/>
+          </w:p>
+        </w:tc>
+        <w:tc>
+          <w:tcPr>
+            <w:tcW w:w="3476" w:type="dxa"/>
+          </w:tcPr>
+          <w:p>
+            <w:proofErr w:type="spellStart"/>
+            <w:proofErr w:type="gramStart"/>
+            <w:r>
+              <w:t>self.practitionerID</w:t>
+            </w:r>
+            <w:proofErr w:type="spellEnd"/>
+            <w:proofErr w:type="gramEnd"/>
+          </w:p>
+        </w:tc>
+        <w:tc>
+          <w:tcPr>
+            <w:tcW w:w="2086" w:type="dxa"/>
+          </w:tcPr>
+          <w:p>
+            <w:r>
+              <w:t>Yes</w:t>
+            </w:r>
+          </w:p>
+        </w:tc>
+        <w:tc>
+          <w:tcPr>
+            <w:tcW w:w="2089" w:type="dxa"/>
+          </w:tcPr>
+          <w:p>
+            <w:r>
+              <w:t>Stores the practitioners unique ID</w:t>
+            </w:r>
+          </w:p>
           <w:p/>
         </w:tc>
       </w:tr>
       <w:tr>
         <w:tc>
           <w:tcPr>
-            <w:tcW w:w="2520" w:type="dxa"/>
-          </w:tcPr>
-          <w:p/>
-        </w:tc>
-        <w:tc>
-          <w:tcPr>
-            <w:tcW w:w="2520" w:type="dxa"/>
-          </w:tcPr>
-          <w:p/>
-        </w:tc>
-        <w:tc>
-          <w:tcPr>
-            <w:tcW w:w="2520" w:type="dxa"/>
-          </w:tcPr>
-          <w:p/>
-        </w:tc>
-        <w:tc>
-          <w:tcPr>
-            <w:tcW w:w="2520" w:type="dxa"/>
-          </w:tcPr>
-          <w:p/>
+            <w:tcW w:w="2419" w:type="dxa"/>
+          </w:tcPr>
+          <w:p>
+            <w:r>
+              <w:t>Name</w:t>
+            </w:r>
+          </w:p>
+        </w:tc>
+        <w:tc>
+          <w:tcPr>
+            <w:tcW w:w="3476" w:type="dxa"/>
+          </w:tcPr>
+          <w:p>
+            <w:r>
+              <w:t>self.name</w:t>
+            </w:r>
+          </w:p>
+        </w:tc>
+        <w:tc>
+          <w:tcPr>
+            <w:tcW w:w="2086" w:type="dxa"/>
+          </w:tcPr>
+          <w:p>
+            <w:r>
+              <w:t>Yes</w:t>
+            </w:r>
+          </w:p>
+        </w:tc>
+        <w:tc>
+          <w:tcPr>
+            <w:tcW w:w="2089" w:type="dxa"/>
+          </w:tcPr>
+          <w:p>
+            <w:r>
+              <w:t>Stores the practitioners name</w:t>
+            </w:r>
+          </w:p>
         </w:tc>
       </w:tr>
       <w:tr>
         <w:tc>
           <w:tcPr>
-            <w:tcW w:w="2520" w:type="dxa"/>
-          </w:tcPr>
-          <w:p/>
-        </w:tc>
-        <w:tc>
-          <w:tcPr>
-            <w:tcW w:w="2520" w:type="dxa"/>
-          </w:tcPr>
-          <w:p/>
-        </w:tc>
-        <w:tc>
-          <w:tcPr>
-            <w:tcW w:w="2520" w:type="dxa"/>
-          </w:tcPr>
-          <w:p/>
-        </w:tc>
-        <w:tc>
-          <w:tcPr>
-            <w:tcW w:w="2520" w:type="dxa"/>
-          </w:tcPr>
-          <w:p/>
+            <w:tcW w:w="2419" w:type="dxa"/>
+          </w:tcPr>
+          <w:p>
+            <w:r>
+              <w:t>availability</w:t>
+            </w:r>
+          </w:p>
+        </w:tc>
+        <w:tc>
+          <w:tcPr>
+            <w:tcW w:w="3476" w:type="dxa"/>
+          </w:tcPr>
+          <w:p>
+            <w:proofErr w:type="spellStart"/>
+            <w:proofErr w:type="gramStart"/>
+            <w:r>
+              <w:t>self.availability</w:t>
+            </w:r>
+            <w:proofErr w:type="spellEnd"/>
+            <w:proofErr w:type="gramEnd"/>
+          </w:p>
+        </w:tc>
+        <w:tc>
+          <w:tcPr>
+            <w:tcW w:w="2086" w:type="dxa"/>
+          </w:tcPr>
+          <w:p>
+            <w:r>
+              <w:t>Yes</w:t>
+            </w:r>
+          </w:p>
+        </w:tc>
+        <w:tc>
+          <w:tcPr>
+            <w:tcW w:w="2089" w:type="dxa"/>
+          </w:tcPr>
+          <w:p>
+            <w:r>
+              <w:t>Stores practitioner availability</w:t>
+            </w:r>
+          </w:p>
+        </w:tc>
+      </w:tr>
+      <w:tr>
+        <w:tc>
+          <w:tcPr>
+            <w:tcW w:w="2419" w:type="dxa"/>
+          </w:tcPr>
+          <w:p>
+            <w:proofErr w:type="spellStart"/>
+            <w:proofErr w:type="gramStart"/>
+            <w:r>
+              <w:t>provideAvailability</w:t>
+            </w:r>
+            <w:proofErr w:type="spellEnd"/>
+            <w:r>
+              <w:t>(</w:t>
+            </w:r>
+            <w:proofErr w:type="gramEnd"/>
+            <w:r>
+              <w:t>)</w:t>
+            </w:r>
+          </w:p>
+        </w:tc>
+        <w:tc>
+          <w:tcPr>
+            <w:tcW w:w="3476" w:type="dxa"/>
+          </w:tcPr>
+          <w:p>
+            <w:proofErr w:type="spellStart"/>
+            <w:r>
+              <w:t>Practitioner.provideAvailability</w:t>
+            </w:r>
+            <w:proofErr w:type="spellEnd"/>
+            <w:r>
+              <w:t>()</w:t>
+            </w:r>
+          </w:p>
+        </w:tc>
+        <w:tc>
+          <w:tcPr>
+            <w:tcW w:w="2086" w:type="dxa"/>
+          </w:tcPr>
+          <w:p>
+            <w:r>
+              <w:t>Yes</w:t>
+            </w:r>
+          </w:p>
+        </w:tc>
+        <w:tc>
+          <w:tcPr>
+            <w:tcW w:w="2089" w:type="dxa"/>
+          </w:tcPr>
+          <w:p>
+            <w:r>
+              <w:t>Displays the practitioner’s availability.</w:t>
+            </w:r>
+          </w:p>
+        </w:tc>
+      </w:tr>
+      <w:tr>
+        <w:tc>
+          <w:tcPr>
+            <w:tcW w:w="2419" w:type="dxa"/>
+          </w:tcPr>
+          <w:p>
+            <w:proofErr w:type="spellStart"/>
+            <w:proofErr w:type="gramStart"/>
+            <w:r>
+              <w:t>manageAppointments</w:t>
+            </w:r>
+            <w:proofErr w:type="spellEnd"/>
+            <w:r>
+              <w:t>(</w:t>
+            </w:r>
+            <w:proofErr w:type="gramEnd"/>
+            <w:r>
+              <w:t>)</w:t>
+            </w:r>
+          </w:p>
+        </w:tc>
+        <w:tc>
+          <w:tcPr>
+            <w:tcW w:w="3476" w:type="dxa"/>
+          </w:tcPr>
+          <w:p>
+            <w:proofErr w:type="spellStart"/>
+            <w:r>
+              <w:t>Practitioner.manageAppointments</w:t>
+            </w:r>
+            <w:proofErr w:type="spellEnd"/>
+            <w:r>
+              <w:t>()</w:t>
+            </w:r>
+          </w:p>
+        </w:tc>
+        <w:tc>
+          <w:tcPr>
+            <w:tcW w:w="2086" w:type="dxa"/>
+          </w:tcPr>
+          <w:p>
+            <w:r>
+              <w:t>Yes</w:t>
+            </w:r>
+          </w:p>
+        </w:tc>
+        <w:tc>
+          <w:tcPr>
+            <w:tcW w:w="2089" w:type="dxa"/>
+          </w:tcPr>
+          <w:p>
+            <w:r>
+              <w:t>Represents the practitioner’s appointment management operation.</w:t>
+            </w:r>
+          </w:p>
+        </w:tc>
+      </w:tr>
+      <w:tr>
+        <w:tc>
+          <w:tcPr>
+            <w:tcW w:w="2419" w:type="dxa"/>
+          </w:tcPr>
+          <w:p>
+            <w:r>
+              <w:t>Appointment class</w:t>
+            </w:r>
+          </w:p>
+        </w:tc>
+        <w:tc>
+          <w:tcPr>
+            <w:tcW w:w="3476" w:type="dxa"/>
+          </w:tcPr>
+          <w:p>
+            <w:r>
+              <w:t>Class Appointment</w:t>
+            </w:r>
+          </w:p>
+        </w:tc>
+        <w:tc>
+          <w:tcPr>
+            <w:tcW w:w="2086" w:type="dxa"/>
+          </w:tcPr>
+          <w:p>
+            <w:r>
+              <w:t xml:space="preserve">Yes </w:t>
+            </w:r>
+          </w:p>
+        </w:tc>
+        <w:tc>
+          <w:tcPr>
+            <w:tcW w:w="2089" w:type="dxa"/>
+          </w:tcPr>
+          <w:p>
+            <w:r>
+              <w:t>Implemented as the central appointment domain class.</w:t>
+            </w:r>
+          </w:p>
+        </w:tc>
+      </w:tr>
+      <w:tr>
+        <w:tc>
+          <w:tcPr>
+            <w:tcW w:w="2419" w:type="dxa"/>
+          </w:tcPr>
+          <w:p>
+            <w:proofErr w:type="spellStart"/>
+            <w:r>
+              <w:lastRenderedPageBreak/>
+              <w:t>appointmentID</w:t>
+            </w:r>
+            <w:proofErr w:type="spellEnd"/>
+          </w:p>
+        </w:tc>
+        <w:tc>
+          <w:tcPr>
+            <w:tcW w:w="3476" w:type="dxa"/>
+          </w:tcPr>
+          <w:p>
+            <w:proofErr w:type="spellStart"/>
+            <w:r>
+              <w:t>Self.appointmentID</w:t>
+            </w:r>
+            <w:proofErr w:type="spellEnd"/>
+          </w:p>
+        </w:tc>
+        <w:tc>
+          <w:tcPr>
+            <w:tcW w:w="2086" w:type="dxa"/>
+          </w:tcPr>
+          <w:p>
+            <w:r>
+              <w:t>Yes</w:t>
+            </w:r>
+          </w:p>
+        </w:tc>
+        <w:tc>
+          <w:tcPr>
+            <w:tcW w:w="2089" w:type="dxa"/>
+          </w:tcPr>
+          <w:p>
+            <w:r>
+              <w:t>Stores the appointment ID</w:t>
+            </w:r>
+          </w:p>
+        </w:tc>
+      </w:tr>
+      <w:tr>
+        <w:tc>
+          <w:tcPr>
+            <w:tcW w:w="2419" w:type="dxa"/>
+          </w:tcPr>
+          <w:p>
+            <w:proofErr w:type="spellStart"/>
+            <w:r>
+              <w:t>dateTime</w:t>
+            </w:r>
+            <w:proofErr w:type="spellEnd"/>
+          </w:p>
+        </w:tc>
+        <w:tc>
+          <w:tcPr>
+            <w:tcW w:w="3476" w:type="dxa"/>
+          </w:tcPr>
+          <w:p>
+            <w:proofErr w:type="spellStart"/>
+            <w:r>
+              <w:t>Self.dateTime</w:t>
+            </w:r>
+            <w:proofErr w:type="spellEnd"/>
+          </w:p>
+        </w:tc>
+        <w:tc>
+          <w:tcPr>
+            <w:tcW w:w="2086" w:type="dxa"/>
+          </w:tcPr>
+          <w:p>
+            <w:r>
+              <w:t>Yes</w:t>
+            </w:r>
+          </w:p>
+        </w:tc>
+        <w:tc>
+          <w:tcPr>
+            <w:tcW w:w="2089" w:type="dxa"/>
+          </w:tcPr>
+          <w:p>
+            <w:r>
+              <w:t>Stores the appointment date and time.</w:t>
+            </w:r>
+          </w:p>
+        </w:tc>
+      </w:tr>
+      <w:tr>
+        <w:tc>
+          <w:tcPr>
+            <w:tcW w:w="2419" w:type="dxa"/>
+          </w:tcPr>
+          <w:p>
+            <w:r>
+              <w:t>Status</w:t>
+            </w:r>
+          </w:p>
+        </w:tc>
+        <w:tc>
+          <w:tcPr>
+            <w:tcW w:w="3476" w:type="dxa"/>
+          </w:tcPr>
+          <w:p>
+            <w:proofErr w:type="spellStart"/>
+            <w:r>
+              <w:t>Self.status</w:t>
+            </w:r>
+            <w:proofErr w:type="spellEnd"/>
+          </w:p>
+        </w:tc>
+        <w:tc>
+          <w:tcPr>
+            <w:tcW w:w="2086" w:type="dxa"/>
+          </w:tcPr>
+          <w:p>
+            <w:r>
+              <w:t>Yes</w:t>
+            </w:r>
+          </w:p>
+        </w:tc>
+        <w:tc>
+          <w:tcPr>
+            <w:tcW w:w="2089" w:type="dxa"/>
+          </w:tcPr>
+          <w:p>
+            <w:r>
+              <w:t>Stores the appointment status.</w:t>
+            </w:r>
+          </w:p>
+        </w:tc>
+      </w:tr>
+      <w:tr>
+        <w:tc>
+          <w:tcPr>
+            <w:tcW w:w="2419" w:type="dxa"/>
+          </w:tcPr>
+          <w:p>
+            <w:proofErr w:type="spellStart"/>
+            <w:proofErr w:type="gramStart"/>
+            <w:r>
+              <w:t>createBooking</w:t>
+            </w:r>
+            <w:proofErr w:type="spellEnd"/>
+            <w:r>
+              <w:t>(</w:t>
+            </w:r>
+            <w:proofErr w:type="gramEnd"/>
+            <w:r>
+              <w:t>)</w:t>
+            </w:r>
+          </w:p>
+        </w:tc>
+        <w:tc>
+          <w:tcPr>
+            <w:tcW w:w="3476" w:type="dxa"/>
+          </w:tcPr>
+          <w:p>
+            <w:proofErr w:type="spellStart"/>
+            <w:r>
+              <w:t>Appointment.createBooking</w:t>
+            </w:r>
+            <w:proofErr w:type="spellEnd"/>
+            <w:r>
+              <w:t>()</w:t>
+            </w:r>
+          </w:p>
+        </w:tc>
+        <w:tc>
+          <w:tcPr>
+            <w:tcW w:w="2086" w:type="dxa"/>
+          </w:tcPr>
+          <w:p>
+            <w:r>
+              <w:t>Yes</w:t>
+            </w:r>
+          </w:p>
+        </w:tc>
+        <w:tc>
+          <w:tcPr>
+            <w:tcW w:w="2089" w:type="dxa"/>
+          </w:tcPr>
+          <w:p>
+            <w:r>
+              <w:t>Creates a booking and prevents duplicate practitioner/time bookings</w:t>
+            </w:r>
+          </w:p>
+        </w:tc>
+      </w:tr>
+      <w:tr>
+        <w:tc>
+          <w:tcPr>
+            <w:tcW w:w="2419" w:type="dxa"/>
+          </w:tcPr>
+          <w:p>
+            <w:proofErr w:type="gramStart"/>
+            <w:r>
+              <w:t>Cancel(</w:t>
+            </w:r>
+            <w:proofErr w:type="gramEnd"/>
+            <w:r>
+              <w:t>)</w:t>
+            </w:r>
+          </w:p>
+        </w:tc>
+        <w:tc>
+          <w:tcPr>
+            <w:tcW w:w="3476" w:type="dxa"/>
+          </w:tcPr>
+          <w:p>
+            <w:proofErr w:type="spellStart"/>
+            <w:r>
+              <w:t>Appointment.cancel</w:t>
+            </w:r>
+            <w:proofErr w:type="spellEnd"/>
+            <w:r>
+              <w:t>()</w:t>
+            </w:r>
+          </w:p>
+        </w:tc>
+        <w:tc>
+          <w:tcPr>
+            <w:tcW w:w="2086" w:type="dxa"/>
+          </w:tcPr>
+          <w:p>
+            <w:r>
+              <w:t xml:space="preserve">Yes </w:t>
+            </w:r>
+          </w:p>
+        </w:tc>
+        <w:tc>
+          <w:tcPr>
+            <w:tcW w:w="2089" w:type="dxa"/>
+          </w:tcPr>
+          <w:p>
+            <w:r>
+              <w:t>Change the appointment status to cancelled and release the booking slot.</w:t>
+            </w:r>
+          </w:p>
+        </w:tc>
+      </w:tr>
+      <w:tr>
+        <w:tc>
+          <w:tcPr>
+            <w:tcW w:w="2419" w:type="dxa"/>
+          </w:tcPr>
+          <w:p>
+            <w:proofErr w:type="spellStart"/>
+            <w:proofErr w:type="gramStart"/>
+            <w:r>
+              <w:t>Checkstatus</w:t>
+            </w:r>
+            <w:proofErr w:type="spellEnd"/>
+            <w:r>
+              <w:t>(</w:t>
+            </w:r>
+            <w:proofErr w:type="gramEnd"/>
+            <w:r>
+              <w:t>)</w:t>
+            </w:r>
+          </w:p>
+        </w:tc>
+        <w:tc>
+          <w:tcPr>
+            <w:tcW w:w="3476" w:type="dxa"/>
+          </w:tcPr>
+          <w:p>
+            <w:proofErr w:type="spellStart"/>
+            <w:r>
+              <w:t>Appointment.checkStatus</w:t>
+            </w:r>
+            <w:proofErr w:type="spellEnd"/>
+            <w:r>
+              <w:t>()</w:t>
+            </w:r>
+          </w:p>
+        </w:tc>
+        <w:tc>
+          <w:tcPr>
+            <w:tcW w:w="2086" w:type="dxa"/>
+          </w:tcPr>
+          <w:p>
+            <w:r>
+              <w:t>Yes</w:t>
+            </w:r>
+          </w:p>
+        </w:tc>
+        <w:tc>
+          <w:tcPr>
+            <w:tcW w:w="2089" w:type="dxa"/>
+          </w:tcPr>
+          <w:p>
+            <w:r>
+              <w:t>Return the appointment status</w:t>
+            </w:r>
+          </w:p>
+        </w:tc>
+      </w:tr>
+      <w:tr>
+        <w:tc>
+          <w:tcPr>
+            <w:tcW w:w="2419" w:type="dxa"/>
+          </w:tcPr>
+          <w:p>
+            <w:r>
+              <w:t>Patient-Appointment relationship</w:t>
+            </w:r>
+          </w:p>
+        </w:tc>
+        <w:tc>
+          <w:tcPr>
+            <w:tcW w:w="3476" w:type="dxa"/>
+          </w:tcPr>
+          <w:p>
+            <w:proofErr w:type="spellStart"/>
+            <w:r>
+              <w:t>Self.patient</w:t>
+            </w:r>
+            <w:proofErr w:type="spellEnd"/>
+          </w:p>
+        </w:tc>
+        <w:tc>
+          <w:tcPr>
+            <w:tcW w:w="2086" w:type="dxa"/>
+          </w:tcPr>
+          <w:p>
+            <w:r>
+              <w:t xml:space="preserve">Yes </w:t>
+            </w:r>
+          </w:p>
+        </w:tc>
+        <w:tc>
+          <w:tcPr>
+            <w:tcW w:w="2089" w:type="dxa"/>
+          </w:tcPr>
+          <w:p>
+            <w:r>
+              <w:t>Appointment stores its associated Patients object.</w:t>
+            </w:r>
+          </w:p>
+        </w:tc>
+      </w:tr>
+      <w:tr>
+        <w:tc>
+          <w:tcPr>
+            <w:tcW w:w="2419" w:type="dxa"/>
+          </w:tcPr>
+          <w:p>
+            <w:r>
+              <w:t>Practitioner- Appointment relationship</w:t>
+            </w:r>
+          </w:p>
+        </w:tc>
+        <w:tc>
+          <w:tcPr>
+            <w:tcW w:w="3476" w:type="dxa"/>
+          </w:tcPr>
+          <w:p>
+            <w:proofErr w:type="spellStart"/>
+            <w:r>
+              <w:t>Self.practitoner</w:t>
+            </w:r>
+            <w:proofErr w:type="spellEnd"/>
+          </w:p>
+        </w:tc>
+        <w:tc>
+          <w:tcPr>
+            <w:tcW w:w="2086" w:type="dxa"/>
+          </w:tcPr>
+          <w:p>
+            <w:r>
+              <w:t>Yes</w:t>
+            </w:r>
+          </w:p>
+        </w:tc>
+        <w:tc>
+          <w:tcPr>
+            <w:tcW w:w="2089" w:type="dxa"/>
+          </w:tcPr>
+          <w:p>
+            <w:r>
+              <w:t>Appointment stores its associated practitioner object.</w:t>
+            </w:r>
+          </w:p>
         </w:tc>
       </w:tr>
     </w:tbl>
@@ -370,7 +1136,7 @@
       <w:tr>
         <w:tc>
           <w:tcPr>
-            <w:tcW w:w="3360" w:type="dxa"/>
+            <w:tcW w:w="3356" w:type="dxa"/>
           </w:tcPr>
           <w:p>
             <w:r>
@@ -380,7 +1146,7 @@
         </w:tc>
         <w:tc>
           <w:tcPr>
-            <w:tcW w:w="3360" w:type="dxa"/>
+            <w:tcW w:w="3357" w:type="dxa"/>
           </w:tcPr>
           <w:p>
             <w:r>
@@ -390,7 +1156,7 @@
         </w:tc>
         <w:tc>
           <w:tcPr>
-            <w:tcW w:w="3360" w:type="dxa"/>
+            <w:tcW w:w="3357" w:type="dxa"/>
           </w:tcPr>
           <w:p>
             <w:r>
@@ -402,121 +1168,621 @@
       <w:tr>
         <w:tc>
           <w:tcPr>
-            <w:tcW w:w="3360" w:type="dxa"/>
-          </w:tcPr>
-          <w:p/>
-        </w:tc>
-        <w:tc>
-          <w:tcPr>
-            <w:tcW w:w="3360" w:type="dxa"/>
-          </w:tcPr>
-          <w:p/>
-        </w:tc>
-        <w:tc>
-          <w:tcPr>
-            <w:tcW w:w="3360" w:type="dxa"/>
-          </w:tcPr>
-          <w:p/>
+            <w:tcW w:w="3356" w:type="dxa"/>
+          </w:tcPr>
+          <w:p>
+            <w:r>
+              <w:t>Patient</w:t>
+            </w:r>
+          </w:p>
+        </w:tc>
+        <w:tc>
+          <w:tcPr>
+            <w:tcW w:w="3357" w:type="dxa"/>
+          </w:tcPr>
+          <w:p>
+            <w:r>
+              <w:t>Patient ID cannot be empty</w:t>
+            </w:r>
+          </w:p>
+        </w:tc>
+        <w:tc>
+          <w:tcPr>
+            <w:tcW w:w="3357" w:type="dxa"/>
+          </w:tcPr>
+          <w:p>
+            <w:proofErr w:type="spellStart"/>
+            <w:r>
+              <w:t>ValueError</w:t>
+            </w:r>
+            <w:proofErr w:type="spellEnd"/>
+            <w:r>
+              <w:t xml:space="preserve"> is raised in </w:t>
+            </w:r>
+            <w:proofErr w:type="gramStart"/>
+            <w:r>
+              <w:t>Patient.---</w:t>
+            </w:r>
+            <w:proofErr w:type="spellStart"/>
+            <w:proofErr w:type="gramEnd"/>
+            <w:r>
+              <w:t>init</w:t>
+            </w:r>
+            <w:proofErr w:type="spellEnd"/>
+            <w:r>
+              <w:t>_ _ ()</w:t>
+            </w:r>
+          </w:p>
         </w:tc>
       </w:tr>
       <w:tr>
         <w:tc>
           <w:tcPr>
-            <w:tcW w:w="3360" w:type="dxa"/>
-          </w:tcPr>
-          <w:p/>
-        </w:tc>
-        <w:tc>
-          <w:tcPr>
-            <w:tcW w:w="3360" w:type="dxa"/>
-          </w:tcPr>
-          <w:p/>
-        </w:tc>
-        <w:tc>
-          <w:tcPr>
-            <w:tcW w:w="3360" w:type="dxa"/>
-          </w:tcPr>
-          <w:p/>
+            <w:tcW w:w="3356" w:type="dxa"/>
+          </w:tcPr>
+          <w:p>
+            <w:r>
+              <w:t>Patient</w:t>
+            </w:r>
+          </w:p>
+        </w:tc>
+        <w:tc>
+          <w:tcPr>
+            <w:tcW w:w="3357" w:type="dxa"/>
+          </w:tcPr>
+          <w:p>
+            <w:r>
+              <w:t>Patient name cannot be empty</w:t>
+            </w:r>
+          </w:p>
+        </w:tc>
+        <w:tc>
+          <w:tcPr>
+            <w:tcW w:w="3357" w:type="dxa"/>
+          </w:tcPr>
+          <w:p>
+            <w:proofErr w:type="spellStart"/>
+            <w:r>
+              <w:t>ValueError</w:t>
+            </w:r>
+            <w:proofErr w:type="spellEnd"/>
+            <w:r>
+              <w:t xml:space="preserve"> is raised in </w:t>
+            </w:r>
+            <w:proofErr w:type="gramStart"/>
+            <w:r>
+              <w:t>Patient.---</w:t>
+            </w:r>
+            <w:proofErr w:type="spellStart"/>
+            <w:proofErr w:type="gramEnd"/>
+            <w:r>
+              <w:t>init</w:t>
+            </w:r>
+            <w:proofErr w:type="spellEnd"/>
+            <w:r>
+              <w:t>_ _ ()</w:t>
+            </w:r>
+          </w:p>
         </w:tc>
       </w:tr>
       <w:tr>
         <w:tc>
           <w:tcPr>
-            <w:tcW w:w="3360" w:type="dxa"/>
-          </w:tcPr>
-          <w:p/>
-        </w:tc>
-        <w:tc>
-          <w:tcPr>
-            <w:tcW w:w="3360" w:type="dxa"/>
-          </w:tcPr>
-          <w:p/>
-        </w:tc>
-        <w:tc>
-          <w:tcPr>
-            <w:tcW w:w="3360" w:type="dxa"/>
-          </w:tcPr>
-          <w:p/>
+            <w:tcW w:w="3356" w:type="dxa"/>
+          </w:tcPr>
+          <w:p>
+            <w:r>
+              <w:t xml:space="preserve">Patient </w:t>
+            </w:r>
+          </w:p>
+        </w:tc>
+        <w:tc>
+          <w:tcPr>
+            <w:tcW w:w="3357" w:type="dxa"/>
+          </w:tcPr>
+          <w:p>
+            <w:r>
+              <w:t>Contact details cannot be empty</w:t>
+            </w:r>
+          </w:p>
+        </w:tc>
+        <w:tc>
+          <w:tcPr>
+            <w:tcW w:w="3357" w:type="dxa"/>
+          </w:tcPr>
+          <w:p>
+            <w:proofErr w:type="spellStart"/>
+            <w:r>
+              <w:t>ValueError</w:t>
+            </w:r>
+            <w:proofErr w:type="spellEnd"/>
+            <w:r>
+              <w:t xml:space="preserve"> is raised in </w:t>
+            </w:r>
+            <w:proofErr w:type="gramStart"/>
+            <w:r>
+              <w:t>Patient.---</w:t>
+            </w:r>
+            <w:proofErr w:type="spellStart"/>
+            <w:proofErr w:type="gramEnd"/>
+            <w:r>
+              <w:t>init</w:t>
+            </w:r>
+            <w:proofErr w:type="spellEnd"/>
+            <w:r>
+              <w:t>_ _ ()</w:t>
+            </w:r>
+          </w:p>
         </w:tc>
       </w:tr>
       <w:tr>
         <w:tc>
           <w:tcPr>
-            <w:tcW w:w="3360" w:type="dxa"/>
-          </w:tcPr>
-          <w:p/>
-        </w:tc>
-        <w:tc>
-          <w:tcPr>
-            <w:tcW w:w="3360" w:type="dxa"/>
-          </w:tcPr>
-          <w:p/>
-        </w:tc>
-        <w:tc>
-          <w:tcPr>
-            <w:tcW w:w="3360" w:type="dxa"/>
-          </w:tcPr>
-          <w:p/>
+            <w:tcW w:w="3356" w:type="dxa"/>
+          </w:tcPr>
+          <w:p>
+            <w:r>
+              <w:t>Practitioner</w:t>
+            </w:r>
+          </w:p>
+        </w:tc>
+        <w:tc>
+          <w:tcPr>
+            <w:tcW w:w="3357" w:type="dxa"/>
+          </w:tcPr>
+          <w:p>
+            <w:r>
+              <w:t>Practitioner ID cannot be empty</w:t>
+            </w:r>
+          </w:p>
+        </w:tc>
+        <w:tc>
+          <w:tcPr>
+            <w:tcW w:w="3357" w:type="dxa"/>
+          </w:tcPr>
+          <w:p>
+            <w:proofErr w:type="spellStart"/>
+            <w:r>
+              <w:t>ValueError</w:t>
+            </w:r>
+            <w:proofErr w:type="spellEnd"/>
+            <w:r>
+              <w:t xml:space="preserve"> is raised in </w:t>
+            </w:r>
+            <w:proofErr w:type="gramStart"/>
+            <w:r>
+              <w:t>Practitioner.---</w:t>
+            </w:r>
+            <w:proofErr w:type="spellStart"/>
+            <w:proofErr w:type="gramEnd"/>
+            <w:r>
+              <w:t>init</w:t>
+            </w:r>
+            <w:proofErr w:type="spellEnd"/>
+            <w:r>
+              <w:t>_ _ ()</w:t>
+            </w:r>
+          </w:p>
         </w:tc>
       </w:tr>
       <w:tr>
         <w:tc>
           <w:tcPr>
-            <w:tcW w:w="3360" w:type="dxa"/>
-          </w:tcPr>
-          <w:p/>
-        </w:tc>
-        <w:tc>
-          <w:tcPr>
-            <w:tcW w:w="3360" w:type="dxa"/>
-          </w:tcPr>
-          <w:p/>
-        </w:tc>
-        <w:tc>
-          <w:tcPr>
-            <w:tcW w:w="3360" w:type="dxa"/>
-          </w:tcPr>
-          <w:p/>
+            <w:tcW w:w="3356" w:type="dxa"/>
+          </w:tcPr>
+          <w:p>
+            <w:r>
+              <w:t>Practitioner</w:t>
+            </w:r>
+          </w:p>
+        </w:tc>
+        <w:tc>
+          <w:tcPr>
+            <w:tcW w:w="3357" w:type="dxa"/>
+          </w:tcPr>
+          <w:p>
+            <w:r>
+              <w:t>Practitioner name cannot be empty</w:t>
+            </w:r>
+          </w:p>
+        </w:tc>
+        <w:tc>
+          <w:tcPr>
+            <w:tcW w:w="3357" w:type="dxa"/>
+          </w:tcPr>
+          <w:p>
+            <w:proofErr w:type="spellStart"/>
+            <w:r>
+              <w:t>ValueError</w:t>
+            </w:r>
+            <w:proofErr w:type="spellEnd"/>
+            <w:r>
+              <w:t xml:space="preserve"> is raised in </w:t>
+            </w:r>
+            <w:proofErr w:type="gramStart"/>
+            <w:r>
+              <w:t>Practitioner.---</w:t>
+            </w:r>
+            <w:proofErr w:type="spellStart"/>
+            <w:proofErr w:type="gramEnd"/>
+            <w:r>
+              <w:t>init</w:t>
+            </w:r>
+            <w:proofErr w:type="spellEnd"/>
+            <w:r>
+              <w:t>_ _ ()</w:t>
+            </w:r>
+          </w:p>
         </w:tc>
       </w:tr>
       <w:tr>
         <w:tc>
           <w:tcPr>
-            <w:tcW w:w="3360" w:type="dxa"/>
-          </w:tcPr>
-          <w:p/>
-        </w:tc>
-        <w:tc>
-          <w:tcPr>
-            <w:tcW w:w="3360" w:type="dxa"/>
-          </w:tcPr>
-          <w:p/>
-        </w:tc>
-        <w:tc>
-          <w:tcPr>
-            <w:tcW w:w="3360" w:type="dxa"/>
-          </w:tcPr>
-          <w:p/>
+            <w:tcW w:w="3356" w:type="dxa"/>
+          </w:tcPr>
+          <w:p>
+            <w:r>
+              <w:t>Practitioner</w:t>
+            </w:r>
+          </w:p>
+        </w:tc>
+        <w:tc>
+          <w:tcPr>
+            <w:tcW w:w="3357" w:type="dxa"/>
+          </w:tcPr>
+          <w:p>
+            <w:r>
+              <w:t>Practitioner availability cannot be empty</w:t>
+            </w:r>
+          </w:p>
+        </w:tc>
+        <w:tc>
+          <w:tcPr>
+            <w:tcW w:w="3357" w:type="dxa"/>
+          </w:tcPr>
+          <w:p>
+            <w:proofErr w:type="spellStart"/>
+            <w:r>
+              <w:t>ValueError</w:t>
+            </w:r>
+            <w:proofErr w:type="spellEnd"/>
+            <w:r>
+              <w:t xml:space="preserve"> is raised in </w:t>
+            </w:r>
+            <w:proofErr w:type="gramStart"/>
+            <w:r>
+              <w:t>Practitioner.---</w:t>
+            </w:r>
+            <w:proofErr w:type="spellStart"/>
+            <w:proofErr w:type="gramEnd"/>
+            <w:r>
+              <w:t>init</w:t>
+            </w:r>
+            <w:proofErr w:type="spellEnd"/>
+            <w:r>
+              <w:t>_ _ ()</w:t>
+            </w:r>
+          </w:p>
+        </w:tc>
+      </w:tr>
+      <w:tr>
+        <w:tc>
+          <w:tcPr>
+            <w:tcW w:w="3356" w:type="dxa"/>
+          </w:tcPr>
+          <w:p>
+            <w:r>
+              <w:t>Appointment</w:t>
+            </w:r>
+          </w:p>
+        </w:tc>
+        <w:tc>
+          <w:tcPr>
+            <w:tcW w:w="3357" w:type="dxa"/>
+          </w:tcPr>
+          <w:p>
+            <w:r>
+              <w:t>Appointment ID cannot be empty</w:t>
+            </w:r>
+          </w:p>
+        </w:tc>
+        <w:tc>
+          <w:tcPr>
+            <w:tcW w:w="3357" w:type="dxa"/>
+          </w:tcPr>
+          <w:p>
+            <w:proofErr w:type="spellStart"/>
+            <w:r>
+              <w:t>ValueError</w:t>
+            </w:r>
+            <w:proofErr w:type="spellEnd"/>
+            <w:r>
+              <w:t xml:space="preserve"> is raised in </w:t>
+            </w:r>
+            <w:proofErr w:type="gramStart"/>
+            <w:r>
+              <w:t>Appointment.---</w:t>
+            </w:r>
+            <w:proofErr w:type="spellStart"/>
+            <w:proofErr w:type="gramEnd"/>
+            <w:r>
+              <w:t>init</w:t>
+            </w:r>
+            <w:proofErr w:type="spellEnd"/>
+            <w:r>
+              <w:t>_ _ ()</w:t>
+            </w:r>
+          </w:p>
+        </w:tc>
+      </w:tr>
+      <w:tr>
+        <w:tc>
+          <w:tcPr>
+            <w:tcW w:w="3356" w:type="dxa"/>
+          </w:tcPr>
+          <w:p>
+            <w:r>
+              <w:t>Appointment</w:t>
+            </w:r>
+          </w:p>
+        </w:tc>
+        <w:tc>
+          <w:tcPr>
+            <w:tcW w:w="3357" w:type="dxa"/>
+          </w:tcPr>
+          <w:p>
+            <w:r>
+              <w:t>Appointment date/time cannot be empty</w:t>
+            </w:r>
+          </w:p>
+        </w:tc>
+        <w:tc>
+          <w:tcPr>
+            <w:tcW w:w="3357" w:type="dxa"/>
+          </w:tcPr>
+          <w:p>
+            <w:proofErr w:type="spellStart"/>
+            <w:r>
+              <w:t>ValueError</w:t>
+            </w:r>
+            <w:proofErr w:type="spellEnd"/>
+            <w:r>
+              <w:t xml:space="preserve"> is raised in </w:t>
+            </w:r>
+            <w:proofErr w:type="gramStart"/>
+            <w:r>
+              <w:t>Appointment</w:t>
+            </w:r>
+            <w:r>
+              <w:t>.---</w:t>
+            </w:r>
+            <w:proofErr w:type="spellStart"/>
+            <w:proofErr w:type="gramEnd"/>
+            <w:r>
+              <w:t>init</w:t>
+            </w:r>
+            <w:proofErr w:type="spellEnd"/>
+            <w:r>
+              <w:t>_ _ ()</w:t>
+            </w:r>
+          </w:p>
+        </w:tc>
+      </w:tr>
+      <w:tr>
+        <w:tc>
+          <w:tcPr>
+            <w:tcW w:w="3356" w:type="dxa"/>
+          </w:tcPr>
+          <w:p>
+            <w:r>
+              <w:t>Appointment</w:t>
+            </w:r>
+          </w:p>
+        </w:tc>
+        <w:tc>
+          <w:tcPr>
+            <w:tcW w:w="3357" w:type="dxa"/>
+          </w:tcPr>
+          <w:p>
+            <w:r>
+              <w:t>Status must be a Valid Appointment status</w:t>
+            </w:r>
+          </w:p>
+        </w:tc>
+        <w:tc>
+          <w:tcPr>
+            <w:tcW w:w="3357" w:type="dxa"/>
+          </w:tcPr>
+          <w:p>
+            <w:proofErr w:type="spellStart"/>
+            <w:proofErr w:type="gramStart"/>
+            <w:r>
+              <w:t>Isinstance</w:t>
+            </w:r>
+            <w:proofErr w:type="spellEnd"/>
+            <w:r>
+              <w:t>( status</w:t>
+            </w:r>
+            <w:proofErr w:type="gramEnd"/>
+            <w:r>
+              <w:t xml:space="preserve">, </w:t>
+            </w:r>
+            <w:proofErr w:type="spellStart"/>
+            <w:r>
+              <w:t>AppointmentStatus</w:t>
+            </w:r>
+            <w:proofErr w:type="spellEnd"/>
+            <w:r>
+              <w:t>) validation</w:t>
+            </w:r>
+          </w:p>
+        </w:tc>
+      </w:tr>
+      <w:tr>
+        <w:tc>
+          <w:tcPr>
+            <w:tcW w:w="3356" w:type="dxa"/>
+          </w:tcPr>
+          <w:p>
+            <w:r>
+              <w:t>Appointment</w:t>
+            </w:r>
+          </w:p>
+        </w:tc>
+        <w:tc>
+          <w:tcPr>
+            <w:tcW w:w="3357" w:type="dxa"/>
+          </w:tcPr>
+          <w:p>
+            <w:r>
+              <w:t>Patient must be a valid Patient object</w:t>
+            </w:r>
+          </w:p>
+        </w:tc>
+        <w:tc>
+          <w:tcPr>
+            <w:tcW w:w="3357" w:type="dxa"/>
+          </w:tcPr>
+          <w:p>
+            <w:proofErr w:type="spellStart"/>
+            <w:proofErr w:type="gramStart"/>
+            <w:r>
+              <w:t>Isinstance</w:t>
+            </w:r>
+            <w:proofErr w:type="spellEnd"/>
+            <w:r>
+              <w:t>(</w:t>
+            </w:r>
+            <w:proofErr w:type="gramEnd"/>
+            <w:r>
+              <w:t>patient, Patient) validation</w:t>
+            </w:r>
+          </w:p>
+        </w:tc>
+      </w:tr>
+      <w:tr>
+        <w:tc>
+          <w:tcPr>
+            <w:tcW w:w="3356" w:type="dxa"/>
+          </w:tcPr>
+          <w:p>
+            <w:r>
+              <w:t>Appointment</w:t>
+            </w:r>
+          </w:p>
+        </w:tc>
+        <w:tc>
+          <w:tcPr>
+            <w:tcW w:w="3357" w:type="dxa"/>
+          </w:tcPr>
+          <w:p>
+            <w:r>
+              <w:t>Practitioner must be a valid Practitioner object.</w:t>
+            </w:r>
+          </w:p>
+        </w:tc>
+        <w:tc>
+          <w:tcPr>
+            <w:tcW w:w="3357" w:type="dxa"/>
+          </w:tcPr>
+          <w:p>
+            <w:proofErr w:type="spellStart"/>
+            <w:proofErr w:type="gramStart"/>
+            <w:r>
+              <w:t>Isinstance</w:t>
+            </w:r>
+            <w:proofErr w:type="spellEnd"/>
+            <w:r>
+              <w:t>(</w:t>
+            </w:r>
+            <w:proofErr w:type="gramEnd"/>
+            <w:r>
+              <w:t>practitioner, Practitioner) validation</w:t>
+            </w:r>
+          </w:p>
+        </w:tc>
+      </w:tr>
+      <w:tr>
+        <w:tc>
+          <w:tcPr>
+            <w:tcW w:w="3356" w:type="dxa"/>
+          </w:tcPr>
+          <w:p>
+            <w:r>
+              <w:t>Appointment</w:t>
+            </w:r>
+          </w:p>
+        </w:tc>
+        <w:tc>
+          <w:tcPr>
+            <w:tcW w:w="3357" w:type="dxa"/>
+          </w:tcPr>
+          <w:p>
+            <w:r>
+              <w:t>A practitioner cannot have two bookings at the same date/time</w:t>
+            </w:r>
+          </w:p>
+        </w:tc>
+        <w:tc>
+          <w:tcPr>
+            <w:tcW w:w="3357" w:type="dxa"/>
+          </w:tcPr>
+          <w:p>
+            <w:proofErr w:type="spellStart"/>
+            <w:r>
+              <w:t>bookedSlots</w:t>
+            </w:r>
+            <w:proofErr w:type="spellEnd"/>
+            <w:r>
+              <w:t xml:space="preserve"> is checked before creating a </w:t>
+            </w:r>
+            <w:proofErr w:type="spellStart"/>
+            <w:r>
+              <w:t>bookig</w:t>
+            </w:r>
+            <w:proofErr w:type="spellEnd"/>
+            <w:r>
+              <w:t>.</w:t>
+            </w:r>
+          </w:p>
+        </w:tc>
+      </w:tr>
+      <w:tr>
+        <w:tc>
+          <w:tcPr>
+            <w:tcW w:w="3356" w:type="dxa"/>
+          </w:tcPr>
+          <w:p>
+            <w:r>
+              <w:lastRenderedPageBreak/>
+              <w:t>Appointment</w:t>
+            </w:r>
+          </w:p>
+        </w:tc>
+        <w:tc>
+          <w:tcPr>
+            <w:tcW w:w="3357" w:type="dxa"/>
+          </w:tcPr>
+          <w:p>
+            <w:r>
+              <w:t>An appointment cannot be cancelled twice</w:t>
+            </w:r>
+          </w:p>
+        </w:tc>
+        <w:tc>
+          <w:tcPr>
+            <w:tcW w:w="3357" w:type="dxa"/>
+          </w:tcPr>
+          <w:p>
+            <w:proofErr w:type="gramStart"/>
+            <w:r>
+              <w:t>Cancel(</w:t>
+            </w:r>
+            <w:proofErr w:type="gramEnd"/>
+            <w:r>
+              <w:t>) checks whether status is already cancelled.</w:t>
+            </w:r>
+          </w:p>
         </w:tc>
       </w:tr>
     </w:tbl>
@@ -576,19 +1842,39 @@
           <w:tcPr>
             <w:tcW w:w="3360" w:type="dxa"/>
           </w:tcPr>
-          <w:p/>
+          <w:p>
+            <w:r>
+              <w:t>Patient- Appointment</w:t>
+            </w:r>
+          </w:p>
         </w:tc>
         <w:tc>
           <w:tcPr>
             <w:tcW w:w="3360" w:type="dxa"/>
           </w:tcPr>
-          <w:p/>
+          <w:p>
+            <w:r>
+              <w:t>Association</w:t>
+            </w:r>
+          </w:p>
         </w:tc>
         <w:tc>
           <w:tcPr>
             <w:tcW w:w="3360" w:type="dxa"/>
           </w:tcPr>
-          <w:p/>
+          <w:p>
+            <w:r>
+              <w:t xml:space="preserve"> An appointment is associated with a patient, while a patient can have multiple appointments. The current </w:t>
+            </w:r>
+            <w:proofErr w:type="spellStart"/>
+            <w:r>
+              <w:t>Smartcare</w:t>
+            </w:r>
+            <w:proofErr w:type="spellEnd"/>
+            <w:r>
+              <w:t xml:space="preserve"> model does not require the Appointment object to control the Patient objects lifecycle.</w:t>
+            </w:r>
+          </w:p>
         </w:tc>
       </w:tr>
       <w:tr>
@@ -596,19 +1882,31 @@
           <w:tcPr>
             <w:tcW w:w="3360" w:type="dxa"/>
           </w:tcPr>
-          <w:p/>
+          <w:p>
+            <w:r>
+              <w:t>Practitioner – Appointment</w:t>
+            </w:r>
+          </w:p>
         </w:tc>
         <w:tc>
           <w:tcPr>
             <w:tcW w:w="3360" w:type="dxa"/>
           </w:tcPr>
-          <w:p/>
+          <w:p>
+            <w:r>
+              <w:t>Association</w:t>
+            </w:r>
+          </w:p>
         </w:tc>
         <w:tc>
           <w:tcPr>
             <w:tcW w:w="3360" w:type="dxa"/>
           </w:tcPr>
-          <w:p/>
+          <w:p>
+            <w:r>
+              <w:t>An appointment is associated with a practitioner, while a practitioner can have multiple appointments. The objects remain separate domain concepts.</w:t>
+            </w:r>
+          </w:p>
         </w:tc>
       </w:tr>
       <w:tr>
@@ -616,18 +1914,31 @@
           <w:tcPr>
             <w:tcW w:w="3360" w:type="dxa"/>
           </w:tcPr>
-          <w:p/>
+          <w:p>
+            <w:r>
+              <w:t>Patient inheritance</w:t>
+            </w:r>
+          </w:p>
         </w:tc>
         <w:tc>
           <w:tcPr>
             <w:tcW w:w="3360" w:type="dxa"/>
           </w:tcPr>
-          <w:p/>
+          <w:p>
+            <w:r>
+              <w:t>No inheritance</w:t>
+            </w:r>
+          </w:p>
         </w:tc>
         <w:tc>
           <w:tcPr>
             <w:tcW w:w="3360" w:type="dxa"/>
           </w:tcPr>
+          <w:p>
+            <w:r>
+              <w:t>Patient does not require a superclass in the current SmartCare Model. Adding inheritance would introduce an unnecessary complexity.</w:t>
+            </w:r>
+          </w:p>
           <w:p/>
         </w:tc>
       </w:tr>
@@ -636,19 +1947,31 @@
           <w:tcPr>
             <w:tcW w:w="3360" w:type="dxa"/>
           </w:tcPr>
-          <w:p/>
+          <w:p>
+            <w:r>
+              <w:t>Practitioner inheritance</w:t>
+            </w:r>
+          </w:p>
         </w:tc>
         <w:tc>
           <w:tcPr>
             <w:tcW w:w="3360" w:type="dxa"/>
           </w:tcPr>
-          <w:p/>
+          <w:p>
+            <w:r>
+              <w:t>No inheritance</w:t>
+            </w:r>
+          </w:p>
         </w:tc>
         <w:tc>
           <w:tcPr>
             <w:tcW w:w="3360" w:type="dxa"/>
           </w:tcPr>
-          <w:p/>
+          <w:p>
+            <w:r>
+              <w:t>Practitioner is a separate domain class and there is no justified superclass in the current design.</w:t>
+            </w:r>
+          </w:p>
         </w:tc>
       </w:tr>
       <w:tr>
@@ -656,19 +1979,31 @@
           <w:tcPr>
             <w:tcW w:w="3360" w:type="dxa"/>
           </w:tcPr>
-          <w:p/>
+          <w:p>
+            <w:r>
+              <w:t>Appointment inheritance</w:t>
+            </w:r>
+          </w:p>
         </w:tc>
         <w:tc>
           <w:tcPr>
             <w:tcW w:w="3360" w:type="dxa"/>
           </w:tcPr>
-          <w:p/>
+          <w:p>
+            <w:r>
+              <w:t xml:space="preserve">No inheritance </w:t>
+            </w:r>
+          </w:p>
         </w:tc>
         <w:tc>
           <w:tcPr>
             <w:tcW w:w="3360" w:type="dxa"/>
           </w:tcPr>
-          <w:p/>
+          <w:p>
+            <w:r>
+              <w:t>Appointment represents a separate domain concept and does not require inheritance in the current version.</w:t>
+            </w:r>
+          </w:p>
         </w:tc>
       </w:tr>
     </w:tbl>
@@ -687,16 +2022,16 @@
         <w:tblLook w:val="04A0" w:firstRow="1" w:lastRow="0" w:firstColumn="1" w:lastColumn="0" w:noHBand="0" w:noVBand="1"/>
       </w:tblPr>
       <w:tblGrid>
-        <w:gridCol w:w="2015"/>
-        <w:gridCol w:w="2014"/>
-        <w:gridCol w:w="2014"/>
-        <w:gridCol w:w="2013"/>
-        <w:gridCol w:w="2014"/>
+        <w:gridCol w:w="2195"/>
+        <w:gridCol w:w="1516"/>
+        <w:gridCol w:w="1671"/>
+        <w:gridCol w:w="1847"/>
+        <w:gridCol w:w="2841"/>
       </w:tblGrid>
       <w:tr>
         <w:tc>
           <w:tcPr>
-            <w:tcW w:w="2016" w:type="dxa"/>
+            <w:tcW w:w="2195" w:type="dxa"/>
           </w:tcPr>
           <w:p>
             <w:r>
@@ -706,7 +2041,7 @@
         </w:tc>
         <w:tc>
           <w:tcPr>
-            <w:tcW w:w="2016" w:type="dxa"/>
+            <w:tcW w:w="1516" w:type="dxa"/>
           </w:tcPr>
           <w:p>
             <w:r>
@@ -716,7 +2051,7 @@
         </w:tc>
         <w:tc>
           <w:tcPr>
-            <w:tcW w:w="2016" w:type="dxa"/>
+            <w:tcW w:w="1671" w:type="dxa"/>
           </w:tcPr>
           <w:p>
             <w:r>
@@ -726,7 +2061,7 @@
         </w:tc>
         <w:tc>
           <w:tcPr>
-            <w:tcW w:w="2016" w:type="dxa"/>
+            <w:tcW w:w="1847" w:type="dxa"/>
           </w:tcPr>
           <w:p>
             <w:r>
@@ -736,7 +2071,7 @@
         </w:tc>
         <w:tc>
           <w:tcPr>
-            <w:tcW w:w="2016" w:type="dxa"/>
+            <w:tcW w:w="2841" w:type="dxa"/>
           </w:tcPr>
           <w:p>
             <w:r>
@@ -748,161 +2083,618 @@
       <w:tr>
         <w:tc>
           <w:tcPr>
-            <w:tcW w:w="2016" w:type="dxa"/>
-          </w:tcPr>
-          <w:p/>
-        </w:tc>
-        <w:tc>
-          <w:tcPr>
-            <w:tcW w:w="2016" w:type="dxa"/>
-          </w:tcPr>
-          <w:p/>
-        </w:tc>
-        <w:tc>
-          <w:tcPr>
-            <w:tcW w:w="2016" w:type="dxa"/>
-          </w:tcPr>
-          <w:p/>
-        </w:tc>
-        <w:tc>
-          <w:tcPr>
-            <w:tcW w:w="2016" w:type="dxa"/>
-          </w:tcPr>
-          <w:p/>
-        </w:tc>
-        <w:tc>
-          <w:tcPr>
-            <w:tcW w:w="2016" w:type="dxa"/>
-          </w:tcPr>
-          <w:p/>
+            <w:tcW w:w="2195" w:type="dxa"/>
+          </w:tcPr>
+          <w:p>
+            <w:r>
+              <w:t xml:space="preserve">Identified that </w:t>
+            </w:r>
+            <w:proofErr w:type="spellStart"/>
+            <w:r>
+              <w:t>Appointment.cancel</w:t>
+            </w:r>
+            <w:proofErr w:type="spellEnd"/>
+            <w:r>
+              <w:t xml:space="preserve">() needed to be called on an appointment instance rather than using </w:t>
+            </w:r>
+            <w:proofErr w:type="spellStart"/>
+            <w:r>
+              <w:t>Appointment.cancel</w:t>
+            </w:r>
+            <w:proofErr w:type="spellEnd"/>
+            <w:r>
+              <w:t xml:space="preserve"> () without an instance.</w:t>
+            </w:r>
+          </w:p>
+        </w:tc>
+        <w:tc>
+          <w:tcPr>
+            <w:tcW w:w="1516" w:type="dxa"/>
+          </w:tcPr>
+          <w:p>
+            <w:r>
+              <w:t xml:space="preserve">Yes </w:t>
+            </w:r>
+          </w:p>
+        </w:tc>
+        <w:tc>
+          <w:tcPr>
+            <w:tcW w:w="1671" w:type="dxa"/>
+          </w:tcPr>
+          <w:p>
+            <w:r>
+              <w:t>Accepted</w:t>
+            </w:r>
+          </w:p>
+        </w:tc>
+        <w:tc>
+          <w:tcPr>
+            <w:tcW w:w="1847" w:type="dxa"/>
+          </w:tcPr>
+          <w:p>
+            <w:r>
+              <w:t xml:space="preserve">The original implementation caused a missing </w:t>
+            </w:r>
+            <w:r>
+              <w:t>self-error</w:t>
+            </w:r>
+            <w:r>
+              <w:t>.</w:t>
+            </w:r>
+          </w:p>
+        </w:tc>
+        <w:tc>
+          <w:tcPr>
+            <w:tcW w:w="2841" w:type="dxa"/>
+          </w:tcPr>
+          <w:p>
+            <w:r>
+              <w:t>The corrected</w:t>
+            </w:r>
+          </w:p>
         </w:tc>
       </w:tr>
       <w:tr>
         <w:tc>
           <w:tcPr>
-            <w:tcW w:w="2016" w:type="dxa"/>
-          </w:tcPr>
-          <w:p/>
-        </w:tc>
-        <w:tc>
-          <w:tcPr>
-            <w:tcW w:w="2016" w:type="dxa"/>
-          </w:tcPr>
-          <w:p/>
-        </w:tc>
-        <w:tc>
-          <w:tcPr>
-            <w:tcW w:w="2016" w:type="dxa"/>
-          </w:tcPr>
-          <w:p/>
-        </w:tc>
-        <w:tc>
-          <w:tcPr>
-            <w:tcW w:w="2016" w:type="dxa"/>
-          </w:tcPr>
-          <w:p/>
-        </w:tc>
-        <w:tc>
-          <w:tcPr>
-            <w:tcW w:w="2016" w:type="dxa"/>
-          </w:tcPr>
-          <w:p/>
+            <w:tcW w:w="2195" w:type="dxa"/>
+          </w:tcPr>
+          <w:p>
+            <w:r>
+              <w:t>Added patient and practitioner objects to the Appointment class and validated that they are valid Patient and Practitioner objects.</w:t>
+            </w:r>
+          </w:p>
+        </w:tc>
+        <w:tc>
+          <w:tcPr>
+            <w:tcW w:w="1516" w:type="dxa"/>
+          </w:tcPr>
+          <w:p>
+            <w:r>
+              <w:t xml:space="preserve">Yes </w:t>
+            </w:r>
+          </w:p>
+        </w:tc>
+        <w:tc>
+          <w:tcPr>
+            <w:tcW w:w="1671" w:type="dxa"/>
+          </w:tcPr>
+          <w:p>
+            <w:r>
+              <w:t>Accepted</w:t>
+            </w:r>
+          </w:p>
+        </w:tc>
+        <w:tc>
+          <w:tcPr>
+            <w:tcW w:w="1847" w:type="dxa"/>
+          </w:tcPr>
+          <w:p>
+            <w:r>
+              <w:t xml:space="preserve">The approved UML associates Appointment with patient and Practitioner. This keeps the domain objects connected without </w:t>
+            </w:r>
+            <w:r>
+              <w:lastRenderedPageBreak/>
+              <w:t>unnecessary inheritance.</w:t>
+            </w:r>
+          </w:p>
+        </w:tc>
+        <w:tc>
+          <w:tcPr>
+            <w:tcW w:w="2841" w:type="dxa"/>
+          </w:tcPr>
+          <w:p>
+            <w:r>
+              <w:lastRenderedPageBreak/>
+              <w:t xml:space="preserve">The final code accepts patient and practitioner in the Appointment constructor and uses </w:t>
+            </w:r>
+            <w:proofErr w:type="spellStart"/>
+            <w:proofErr w:type="gramStart"/>
+            <w:r>
+              <w:t>iasinstance</w:t>
+            </w:r>
+            <w:proofErr w:type="spellEnd"/>
+            <w:r>
+              <w:t>(</w:t>
+            </w:r>
+            <w:proofErr w:type="gramEnd"/>
+            <w:r>
+              <w:t>) validation.</w:t>
+            </w:r>
+          </w:p>
         </w:tc>
       </w:tr>
       <w:tr>
         <w:tc>
           <w:tcPr>
-            <w:tcW w:w="2016" w:type="dxa"/>
-          </w:tcPr>
-          <w:p/>
-        </w:tc>
-        <w:tc>
-          <w:tcPr>
-            <w:tcW w:w="2016" w:type="dxa"/>
-          </w:tcPr>
-          <w:p/>
-        </w:tc>
-        <w:tc>
-          <w:tcPr>
-            <w:tcW w:w="2016" w:type="dxa"/>
-          </w:tcPr>
-          <w:p/>
-        </w:tc>
-        <w:tc>
-          <w:tcPr>
-            <w:tcW w:w="2016" w:type="dxa"/>
-          </w:tcPr>
-          <w:p/>
-        </w:tc>
-        <w:tc>
-          <w:tcPr>
-            <w:tcW w:w="2016" w:type="dxa"/>
-          </w:tcPr>
-          <w:p/>
+            <w:tcW w:w="2195" w:type="dxa"/>
+          </w:tcPr>
+          <w:p>
+            <w:r>
+              <w:t>Added duplicate – booking prevention using the Practitioner Id and appointment date/time.</w:t>
+            </w:r>
+          </w:p>
+        </w:tc>
+        <w:tc>
+          <w:tcPr>
+            <w:tcW w:w="1516" w:type="dxa"/>
+          </w:tcPr>
+          <w:p>
+            <w:r>
+              <w:t>Yes</w:t>
+            </w:r>
+          </w:p>
+        </w:tc>
+        <w:tc>
+          <w:tcPr>
+            <w:tcW w:w="1671" w:type="dxa"/>
+          </w:tcPr>
+          <w:p>
+            <w:r>
+              <w:t xml:space="preserve">Accepted </w:t>
+            </w:r>
+          </w:p>
+        </w:tc>
+        <w:tc>
+          <w:tcPr>
+            <w:tcW w:w="1847" w:type="dxa"/>
+          </w:tcPr>
+          <w:p>
+            <w:r>
+              <w:t>Duplicate practitioner/time bookings should be prevented according to the approved design.</w:t>
+            </w:r>
+          </w:p>
+        </w:tc>
+        <w:tc>
+          <w:tcPr>
+            <w:tcW w:w="2841" w:type="dxa"/>
+          </w:tcPr>
+          <w:p>
+            <w:r>
+              <w:t xml:space="preserve">The final code stores practitioner/time </w:t>
+            </w:r>
+            <w:proofErr w:type="spellStart"/>
+            <w:r>
+              <w:t>cpmbinations</w:t>
+            </w:r>
+            <w:proofErr w:type="spellEnd"/>
+            <w:r>
+              <w:t xml:space="preserve"> in </w:t>
+            </w:r>
+            <w:proofErr w:type="spellStart"/>
+            <w:r>
+              <w:t>bookedSlots</w:t>
+            </w:r>
+            <w:proofErr w:type="spellEnd"/>
+            <w:r>
+              <w:t xml:space="preserve"> and raises a </w:t>
+            </w:r>
+            <w:proofErr w:type="spellStart"/>
+            <w:r>
+              <w:t>ValueError</w:t>
+            </w:r>
+            <w:proofErr w:type="spellEnd"/>
+            <w:r>
+              <w:t xml:space="preserve"> when the same slot is booked again. The duplicate booking test passed.</w:t>
+            </w:r>
+          </w:p>
         </w:tc>
       </w:tr>
       <w:tr>
         <w:tc>
           <w:tcPr>
-            <w:tcW w:w="2016" w:type="dxa"/>
-          </w:tcPr>
+            <w:tcW w:w="2195" w:type="dxa"/>
+          </w:tcPr>
+          <w:p>
+            <w:r>
+              <w:t xml:space="preserve">Suggested using an </w:t>
+            </w:r>
+            <w:proofErr w:type="spellStart"/>
+            <w:r>
+              <w:t>AppointmentStatus</w:t>
+            </w:r>
+            <w:proofErr w:type="spellEnd"/>
+            <w:r>
+              <w:t xml:space="preserve"> Enum for appointment status.</w:t>
+            </w:r>
+          </w:p>
+        </w:tc>
+        <w:tc>
+          <w:tcPr>
+            <w:tcW w:w="1516" w:type="dxa"/>
+          </w:tcPr>
+          <w:p>
+            <w:r>
+              <w:t>Yes</w:t>
+            </w:r>
+          </w:p>
+        </w:tc>
+        <w:tc>
+          <w:tcPr>
+            <w:tcW w:w="1671" w:type="dxa"/>
+          </w:tcPr>
+          <w:p>
+            <w:r>
+              <w:t>Accepted</w:t>
+            </w:r>
+          </w:p>
+        </w:tc>
+        <w:tc>
+          <w:tcPr>
+            <w:tcW w:w="1847" w:type="dxa"/>
+          </w:tcPr>
+          <w:p>
+            <w:r>
+              <w:t xml:space="preserve">The Enum supports the approved </w:t>
+            </w:r>
+            <w:proofErr w:type="spellStart"/>
+            <w:r>
+              <w:t>ststus</w:t>
+            </w:r>
+            <w:proofErr w:type="spellEnd"/>
+            <w:r>
+              <w:t xml:space="preserve"> rule and keeps appointment status values controlled.</w:t>
+            </w:r>
+          </w:p>
           <w:p/>
         </w:tc>
         <w:tc>
           <w:tcPr>
-            <w:tcW w:w="2016" w:type="dxa"/>
-          </w:tcPr>
-          <w:p/>
-        </w:tc>
-        <w:tc>
-          <w:tcPr>
-            <w:tcW w:w="2016" w:type="dxa"/>
-          </w:tcPr>
-          <w:p/>
-        </w:tc>
-        <w:tc>
-          <w:tcPr>
-            <w:tcW w:w="2016" w:type="dxa"/>
-          </w:tcPr>
-          <w:p/>
-        </w:tc>
-        <w:tc>
-          <w:tcPr>
-            <w:tcW w:w="2016" w:type="dxa"/>
-          </w:tcPr>
-          <w:p/>
+            <w:tcW w:w="2841" w:type="dxa"/>
+          </w:tcPr>
+          <w:p>
+            <w:r>
+              <w:t>Reviewed the generated conde and confirmed that Appointment Status represents the defined appointment states.</w:t>
+            </w:r>
+          </w:p>
         </w:tc>
       </w:tr>
       <w:tr>
         <w:tc>
           <w:tcPr>
-            <w:tcW w:w="2016" w:type="dxa"/>
-          </w:tcPr>
-          <w:p/>
-        </w:tc>
-        <w:tc>
-          <w:tcPr>
-            <w:tcW w:w="2016" w:type="dxa"/>
-          </w:tcPr>
-          <w:p/>
-        </w:tc>
-        <w:tc>
-          <w:tcPr>
-            <w:tcW w:w="2016" w:type="dxa"/>
-          </w:tcPr>
-          <w:p/>
-        </w:tc>
-        <w:tc>
-          <w:tcPr>
-            <w:tcW w:w="2016" w:type="dxa"/>
-          </w:tcPr>
-          <w:p/>
-        </w:tc>
-        <w:tc>
-          <w:tcPr>
-            <w:tcW w:w="2016" w:type="dxa"/>
-          </w:tcPr>
-          <w:p/>
+            <w:tcW w:w="2195" w:type="dxa"/>
+          </w:tcPr>
+          <w:p>
+            <w:r>
+              <w:t>Identified the need to use cancel (0 to control appointment status instead of allowing unrestricted public status change.</w:t>
+            </w:r>
+          </w:p>
+        </w:tc>
+        <w:tc>
+          <w:tcPr>
+            <w:tcW w:w="1516" w:type="dxa"/>
+          </w:tcPr>
+          <w:p>
+            <w:r>
+              <w:t>Yes</w:t>
+            </w:r>
+          </w:p>
+        </w:tc>
+        <w:tc>
+          <w:tcPr>
+            <w:tcW w:w="1671" w:type="dxa"/>
+          </w:tcPr>
+          <w:p>
+            <w:r>
+              <w:t>Modified</w:t>
+            </w:r>
+          </w:p>
+        </w:tc>
+        <w:tc>
+          <w:tcPr>
+            <w:tcW w:w="1847" w:type="dxa"/>
+          </w:tcPr>
+          <w:p>
+            <w:r>
+              <w:t>Directly changing status can break encapsulation. The appointment class should control valid status transitions.</w:t>
+            </w:r>
+          </w:p>
+        </w:tc>
+        <w:tc>
+          <w:tcPr>
+            <w:tcW w:w="2841" w:type="dxa"/>
+          </w:tcPr>
+          <w:p>
+            <w:r>
+              <w:t xml:space="preserve">Tested cancellation through an Appointment instance and confirmed that </w:t>
+            </w:r>
+            <w:proofErr w:type="gramStart"/>
+            <w:r>
+              <w:t>cancel(</w:t>
+            </w:r>
+            <w:proofErr w:type="gramEnd"/>
+            <w:r>
+              <w:t>) changes the status correctly.</w:t>
+            </w:r>
+          </w:p>
+        </w:tc>
+      </w:tr>
+      <w:tr>
+        <w:tc>
+          <w:tcPr>
+            <w:tcW w:w="2195" w:type="dxa"/>
+          </w:tcPr>
+          <w:p>
+            <w:proofErr w:type="spellStart"/>
+            <w:r>
+              <w:t>Modifeid</w:t>
+            </w:r>
+            <w:proofErr w:type="spellEnd"/>
+            <w:r>
+              <w:t xml:space="preserve"> </w:t>
+            </w:r>
+            <w:proofErr w:type="gramStart"/>
+            <w:r>
+              <w:t>cancel(</w:t>
+            </w:r>
+            <w:proofErr w:type="gramEnd"/>
+            <w:r>
+              <w:t>) so that cancelling am appointment also removes its practitioner/</w:t>
+            </w:r>
+            <w:proofErr w:type="spellStart"/>
+            <w:r>
+              <w:t>tiem</w:t>
+            </w:r>
+            <w:proofErr w:type="spellEnd"/>
+            <w:r>
+              <w:t xml:space="preserve"> slot from booked Slots.</w:t>
+            </w:r>
+          </w:p>
+        </w:tc>
+        <w:tc>
+          <w:tcPr>
+            <w:tcW w:w="1516" w:type="dxa"/>
+          </w:tcPr>
+          <w:p>
+            <w:r>
+              <w:t xml:space="preserve">Yes </w:t>
+            </w:r>
+          </w:p>
+        </w:tc>
+        <w:tc>
+          <w:tcPr>
+            <w:tcW w:w="1671" w:type="dxa"/>
+          </w:tcPr>
+          <w:p>
+            <w:r>
+              <w:t>Accepted</w:t>
+            </w:r>
+          </w:p>
+        </w:tc>
+        <w:tc>
+          <w:tcPr>
+            <w:tcW w:w="1847" w:type="dxa"/>
+          </w:tcPr>
+          <w:p>
+            <w:r>
+              <w:t>A cancelled appointment should no longer occupy the practitioner booking slot, allowing another appointment to use the time.</w:t>
+            </w:r>
+          </w:p>
+        </w:tc>
+        <w:tc>
+          <w:tcPr>
+            <w:tcW w:w="2841" w:type="dxa"/>
+          </w:tcPr>
+          <w:p>
+            <w:r>
+              <w:t>After cancelling appointment</w:t>
+            </w:r>
+            <w:proofErr w:type="gramStart"/>
+            <w:r>
+              <w:t>1,appointment</w:t>
+            </w:r>
+            <w:proofErr w:type="gramEnd"/>
+            <w:r>
+              <w:t>3 was created using the same practitioner and time and successfully passed the slot- availability test.</w:t>
+            </w:r>
+          </w:p>
+        </w:tc>
+      </w:tr>
+      <w:tr>
+        <w:tc>
+          <w:tcPr>
+            <w:tcW w:w="2195" w:type="dxa"/>
+          </w:tcPr>
+          <w:p>
+            <w:r>
+              <w:t xml:space="preserve">Confirmed that Appointment should not inherit from Patient, Practitioner, or </w:t>
+            </w:r>
+            <w:proofErr w:type="spellStart"/>
+            <w:r>
+              <w:t>PatientRecord</w:t>
+            </w:r>
+            <w:proofErr w:type="spellEnd"/>
+            <w:r>
+              <w:t>.</w:t>
+            </w:r>
+          </w:p>
+        </w:tc>
+        <w:tc>
+          <w:tcPr>
+            <w:tcW w:w="1516" w:type="dxa"/>
+          </w:tcPr>
+          <w:p>
+            <w:r>
+              <w:t xml:space="preserve">Yes </w:t>
+            </w:r>
+          </w:p>
+        </w:tc>
+        <w:tc>
+          <w:tcPr>
+            <w:tcW w:w="1671" w:type="dxa"/>
+          </w:tcPr>
+          <w:p>
+            <w:r>
+              <w:t>Accepted</w:t>
+            </w:r>
+          </w:p>
+        </w:tc>
+        <w:tc>
+          <w:tcPr>
+            <w:tcW w:w="1847" w:type="dxa"/>
+          </w:tcPr>
+          <w:p>
+            <w:r>
+              <w:t>Appointment is a separate domain class associated with Patient and Practitioner, not a specialized type of either class.</w:t>
+            </w:r>
+          </w:p>
+        </w:tc>
+        <w:tc>
+          <w:tcPr>
+            <w:tcW w:w="2841" w:type="dxa"/>
+          </w:tcPr>
+          <w:p>
+            <w:r>
+              <w:t>Reviewed the approved UML and generated code and confirmed that no unnecessary inheritance was introduced.</w:t>
+            </w:r>
+          </w:p>
+        </w:tc>
+      </w:tr>
+      <w:tr>
+        <w:tc>
+          <w:tcPr>
+            <w:tcW w:w="2195" w:type="dxa"/>
+          </w:tcPr>
+          <w:p>
+            <w:r>
+              <w:t xml:space="preserve">Identified that duplicate </w:t>
+            </w:r>
+            <w:r>
+              <w:t>booking should be checked using practitioner and date/time rather than appointment ID.</w:t>
+            </w:r>
+          </w:p>
+        </w:tc>
+        <w:tc>
+          <w:tcPr>
+            <w:tcW w:w="1516" w:type="dxa"/>
+          </w:tcPr>
+          <w:p>
+            <w:r>
+              <w:t xml:space="preserve">Yes </w:t>
+            </w:r>
+          </w:p>
+        </w:tc>
+        <w:tc>
+          <w:tcPr>
+            <w:tcW w:w="1671" w:type="dxa"/>
+          </w:tcPr>
+          <w:p>
+            <w:r>
+              <w:t>Accepted with further development.</w:t>
+            </w:r>
+          </w:p>
+        </w:tc>
+        <w:tc>
+          <w:tcPr>
+            <w:tcW w:w="1847" w:type="dxa"/>
+          </w:tcPr>
+          <w:p>
+            <w:r>
+              <w:t>Appointment ID is unique for an appointment but should not determine whether a time slot is occupied.</w:t>
+            </w:r>
+            <w:r>
+              <w:t xml:space="preserve"> </w:t>
+            </w:r>
+          </w:p>
+        </w:tc>
+        <w:tc>
+          <w:tcPr>
+            <w:tcW w:w="2841" w:type="dxa"/>
+          </w:tcPr>
+          <w:p>
+            <w:r>
+              <w:t>A002 was rejected when it used the same practitioner and date/time as A001.</w:t>
+            </w:r>
+          </w:p>
+        </w:tc>
+      </w:tr>
+      <w:tr>
+        <w:tc>
+          <w:tcPr>
+            <w:tcW w:w="2195" w:type="dxa"/>
+          </w:tcPr>
+          <w:p>
+            <w:r>
+              <w:t xml:space="preserve">Added validation for invalid Patient, Practitioner and Appointment input and tested invalid </w:t>
+            </w:r>
+            <w:r>
+              <w:lastRenderedPageBreak/>
+              <w:t xml:space="preserve">cases and repeated cancellation. </w:t>
+            </w:r>
+          </w:p>
+        </w:tc>
+        <w:tc>
+          <w:tcPr>
+            <w:tcW w:w="1516" w:type="dxa"/>
+          </w:tcPr>
+          <w:p>
+            <w:r>
+              <w:lastRenderedPageBreak/>
+              <w:t>Yes</w:t>
+            </w:r>
+          </w:p>
+        </w:tc>
+        <w:tc>
+          <w:tcPr>
+            <w:tcW w:w="1671" w:type="dxa"/>
+          </w:tcPr>
+          <w:p>
+            <w:r>
+              <w:t>Accepted</w:t>
+            </w:r>
+          </w:p>
+        </w:tc>
+        <w:tc>
+          <w:tcPr>
+            <w:tcW w:w="1847" w:type="dxa"/>
+          </w:tcPr>
+          <w:p>
+            <w:r>
+              <w:t>Validation prevents objects and helps maintain the domain rules.</w:t>
+            </w:r>
+          </w:p>
+        </w:tc>
+        <w:tc>
+          <w:tcPr>
+            <w:tcW w:w="2841" w:type="dxa"/>
+          </w:tcPr>
+          <w:p>
+            <w:r>
+              <w:t xml:space="preserve">Manual tests confirmed that empty IDs, names and invalid Appointment information raise </w:t>
+            </w:r>
+            <w:proofErr w:type="spellStart"/>
+            <w:r>
+              <w:t>ValueError</w:t>
+            </w:r>
+            <w:proofErr w:type="spellEnd"/>
+            <w:r>
+              <w:t xml:space="preserve">, and attempting to cancel an </w:t>
+            </w:r>
+            <w:r>
+              <w:lastRenderedPageBreak/>
+              <w:t>already cancelled appointment also raised an error.</w:t>
+            </w:r>
+          </w:p>
         </w:tc>
       </w:tr>
     </w:tbl>
@@ -911,13 +2703,25 @@
         <w:pStyle w:val="Heading1"/>
       </w:pPr>
       <w:r>
-        <w:lastRenderedPageBreak/>
         <w:t>5. Updated UML</w:t>
       </w:r>
     </w:p>
     <w:p>
       <w:r>
         <w:t>Insert updated UML only if implementation revealed a justified design change. Explain every change.</w:t>
+      </w:r>
+    </w:p>
+    <w:p>
+      <w:r>
+        <w:t xml:space="preserve">There was no updated UML required. The existing Patient, Practitioner, and Appointment classes remain appropriate. The </w:t>
+      </w:r>
+      <w:proofErr w:type="spellStart"/>
+      <w:r>
+        <w:t>bookedSlots</w:t>
+      </w:r>
+      <w:proofErr w:type="spellEnd"/>
+      <w:r>
+        <w:t xml:space="preserve"> collection was added as an implementation mechanism inside the Appointment class to support duplicate-booking prevention; it does not represent a new domain class or change to the existing domain relationships.</w:t>
       </w:r>
     </w:p>
     <w:sectPr>

</xml_diff>